<commit_message>
added group members info
</commit_message>
<xml_diff>
--- a/RecoMart_Report.docx
+++ b/RecoMart_Report.docx
@@ -67,6 +67,28 @@
           <w:sz w:val="24"/>
         </w:rPr>
         <w:t>Assignment I — EC1 (20 Marks)</w:t>
+      </w:r>
+    </w:p>
+    <w:p>
+      <w:pPr>
+        <w:jc w:val="center"/>
+      </w:pPr>
+      <w:r>
+        <w:rPr>
+          <w:sz w:val="24"/>
+        </w:rPr>
+        <w:t>Group Number: 43</w:t>
+      </w:r>
+    </w:p>
+    <w:p>
+      <w:pPr>
+        <w:jc w:val="center"/>
+      </w:pPr>
+      <w:r>
+        <w:rPr>
+          <w:sz w:val="24"/>
+        </w:rPr>
+        <w:t>Programme: M.Tech AI/ML — BITS Pilani WILP</w:t>
       </w:r>
     </w:p>
     <w:p>
@@ -174,7 +196,7 @@
               <w:rPr>
                 <w:sz w:val="18"/>
               </w:rPr>
-              <w:t>&lt;Your Name&gt;</w:t>
+              <w:t>BRAJESH MISHRA</w:t>
             </w:r>
           </w:p>
         </w:tc>
@@ -190,7 +212,7 @@
               <w:rPr>
                 <w:sz w:val="18"/>
               </w:rPr>
-              <w:t>&lt;Your BITS ID&gt;</w:t>
+              <w:t>2025AB05161</w:t>
             </w:r>
           </w:p>
         </w:tc>
@@ -206,7 +228,7 @@
               <w:rPr>
                 <w:sz w:val="18"/>
               </w:rPr>
-              <w:t>&lt;Your Email&gt;</w:t>
+              <w:t>2025ab05161@wilp.bits-pilani.ac.in</w:t>
             </w:r>
           </w:p>
         </w:tc>
@@ -224,7 +246,7 @@
               <w:rPr>
                 <w:sz w:val="18"/>
               </w:rPr>
-              <w:t>&lt;Member 2 Name&gt;</w:t>
+              <w:t>YENGANTIWAR PRASHANT SAINATH</w:t>
             </w:r>
           </w:p>
         </w:tc>
@@ -240,7 +262,7 @@
               <w:rPr>
                 <w:sz w:val="18"/>
               </w:rPr>
-              <w:t>&lt;BITS ID&gt;</w:t>
+              <w:t>2025AB05178</w:t>
             </w:r>
           </w:p>
         </w:tc>
@@ -256,7 +278,7 @@
               <w:rPr>
                 <w:sz w:val="18"/>
               </w:rPr>
-              <w:t>&lt;Email&gt;</w:t>
+              <w:t>2025ab05178@wilp.bits-pilani.ac.in</w:t>
             </w:r>
           </w:p>
         </w:tc>
@@ -274,7 +296,7 @@
               <w:rPr>
                 <w:sz w:val="18"/>
               </w:rPr>
-              <w:t>&lt;Member 3 Name&gt;</w:t>
+              <w:t>ARTHIKA G</w:t>
             </w:r>
           </w:p>
         </w:tc>
@@ -290,7 +312,7 @@
               <w:rPr>
                 <w:sz w:val="18"/>
               </w:rPr>
-              <w:t>&lt;BITS ID&gt;</w:t>
+              <w:t>2025AB05180</w:t>
             </w:r>
           </w:p>
         </w:tc>
@@ -306,7 +328,107 @@
               <w:rPr>
                 <w:sz w:val="18"/>
               </w:rPr>
-              <w:t>&lt;Email&gt;</w:t>
+              <w:t>2025ab05180@wilp.bits-pilani.ac.in</w:t>
+            </w:r>
+          </w:p>
+        </w:tc>
+      </w:tr>
+      <w:tr>
+        <w:tc>
+          <w:tcPr>
+            <w:tcW w:type="dxa" w:w="3135"/>
+          </w:tcPr>
+          <w:p>
+            <w:pPr>
+              <w:jc w:val="center"/>
+            </w:pPr>
+            <w:r>
+              <w:rPr>
+                <w:sz w:val="18"/>
+              </w:rPr>
+              <w:t>A SRIKAR</w:t>
+            </w:r>
+          </w:p>
+        </w:tc>
+        <w:tc>
+          <w:tcPr>
+            <w:tcW w:type="dxa" w:w="3135"/>
+          </w:tcPr>
+          <w:p>
+            <w:pPr>
+              <w:jc w:val="center"/>
+            </w:pPr>
+            <w:r>
+              <w:rPr>
+                <w:sz w:val="18"/>
+              </w:rPr>
+              <w:t>2025AB05185</w:t>
+            </w:r>
+          </w:p>
+        </w:tc>
+        <w:tc>
+          <w:tcPr>
+            <w:tcW w:type="dxa" w:w="3135"/>
+          </w:tcPr>
+          <w:p>
+            <w:pPr>
+              <w:jc w:val="center"/>
+            </w:pPr>
+            <w:r>
+              <w:rPr>
+                <w:sz w:val="18"/>
+              </w:rPr>
+              <w:t>2025ab05185@wilp.bits-pilani.ac.in</w:t>
+            </w:r>
+          </w:p>
+        </w:tc>
+      </w:tr>
+      <w:tr>
+        <w:tc>
+          <w:tcPr>
+            <w:tcW w:type="dxa" w:w="3135"/>
+          </w:tcPr>
+          <w:p>
+            <w:pPr>
+              <w:jc w:val="center"/>
+            </w:pPr>
+            <w:r>
+              <w:rPr>
+                <w:sz w:val="18"/>
+              </w:rPr>
+              <w:t>GIRIDHARAN B</w:t>
+            </w:r>
+          </w:p>
+        </w:tc>
+        <w:tc>
+          <w:tcPr>
+            <w:tcW w:type="dxa" w:w="3135"/>
+          </w:tcPr>
+          <w:p>
+            <w:pPr>
+              <w:jc w:val="center"/>
+            </w:pPr>
+            <w:r>
+              <w:rPr>
+                <w:sz w:val="18"/>
+              </w:rPr>
+              <w:t>2025AB05188</w:t>
+            </w:r>
+          </w:p>
+        </w:tc>
+        <w:tc>
+          <w:tcPr>
+            <w:tcW w:type="dxa" w:w="3135"/>
+          </w:tcPr>
+          <w:p>
+            <w:pPr>
+              <w:jc w:val="center"/>
+            </w:pPr>
+            <w:r>
+              <w:rPr>
+                <w:sz w:val="18"/>
+              </w:rPr>
+              <w:t>2025ab05188@wilp.bits-pilani.ac.in</w:t>
             </w:r>
           </w:p>
         </w:tc>

</xml_diff>

<commit_message>
added screenshots & updated word DOCX
</commit_message>
<xml_diff>
--- a/RecoMart_Report.docx
+++ b/RecoMart_Report.docx
@@ -1215,7 +1215,7 @@
       <w:r>
         <w:drawing>
           <wp:inline xmlns:a="http://schemas.openxmlformats.org/drawingml/2006/main" xmlns:pic="http://schemas.openxmlformats.org/drawingml/2006/picture">
-            <wp:extent cx="4572000" cy="5437139"/>
+            <wp:extent cx="4572000" cy="2428875"/>
             <wp:docPr id="1" name="Picture 1"/>
             <wp:cNvGraphicFramePr>
               <a:graphicFrameLocks noChangeAspect="1"/>
@@ -1236,7 +1236,7 @@
                   <pic:spPr>
                     <a:xfrm>
                       <a:off x="0" y="0"/>
-                      <a:ext cx="4572000" cy="5437139"/>
+                      <a:ext cx="4572000" cy="2428875"/>
                     </a:xfrm>
                     <a:prstGeom prst="rect"/>
                   </pic:spPr>
@@ -1393,7 +1393,7 @@
       <w:r>
         <w:drawing>
           <wp:inline xmlns:a="http://schemas.openxmlformats.org/drawingml/2006/main" xmlns:pic="http://schemas.openxmlformats.org/drawingml/2006/picture">
-            <wp:extent cx="5486400" cy="2242082"/>
+            <wp:extent cx="5486400" cy="2914650"/>
             <wp:docPr id="2" name="Picture 2"/>
             <wp:cNvGraphicFramePr>
               <a:graphicFrameLocks noChangeAspect="1"/>
@@ -1414,7 +1414,7 @@
                   <pic:spPr>
                     <a:xfrm>
                       <a:off x="0" y="0"/>
-                      <a:ext cx="5486400" cy="2242082"/>
+                      <a:ext cx="5486400" cy="2914650"/>
                     </a:xfrm>
                     <a:prstGeom prst="rect"/>
                   </pic:spPr>
@@ -1961,7 +1961,7 @@
       <w:r>
         <w:drawing>
           <wp:inline xmlns:a="http://schemas.openxmlformats.org/drawingml/2006/main" xmlns:pic="http://schemas.openxmlformats.org/drawingml/2006/picture">
-            <wp:extent cx="5486400" cy="3048578"/>
+            <wp:extent cx="5486400" cy="2914650"/>
             <wp:docPr id="9" name="Picture 9"/>
             <wp:cNvGraphicFramePr>
               <a:graphicFrameLocks noChangeAspect="1"/>
@@ -1982,7 +1982,7 @@
                   <pic:spPr>
                     <a:xfrm>
                       <a:off x="0" y="0"/>
-                      <a:ext cx="5486400" cy="3048578"/>
+                      <a:ext cx="5486400" cy="2914650"/>
                     </a:xfrm>
                     <a:prstGeom prst="rect"/>
                   </pic:spPr>
@@ -2039,7 +2039,7 @@
       <w:r>
         <w:drawing>
           <wp:inline xmlns:a="http://schemas.openxmlformats.org/drawingml/2006/main" xmlns:pic="http://schemas.openxmlformats.org/drawingml/2006/picture">
-            <wp:extent cx="5486400" cy="2353586"/>
+            <wp:extent cx="5486400" cy="3086100"/>
             <wp:docPr id="10" name="Picture 10"/>
             <wp:cNvGraphicFramePr>
               <a:graphicFrameLocks noChangeAspect="1"/>
@@ -2060,7 +2060,7 @@
                   <pic:spPr>
                     <a:xfrm>
                       <a:off x="0" y="0"/>
-                      <a:ext cx="5486400" cy="2353586"/>
+                      <a:ext cx="5486400" cy="3086100"/>
                     </a:xfrm>
                     <a:prstGeom prst="rect"/>
                   </pic:spPr>
@@ -2767,7 +2767,7 @@
     </w:p>
     <w:p>
       <w:r>
-        <w:t>MLflow Run ID: c1a93a1803a248e097f445287623bbec</w:t>
+        <w:t>MLflow Run ID: 66676fa9988749a9a9a4fffa7938ad6b</w:t>
       </w:r>
     </w:p>
     <w:p>
@@ -2839,7 +2839,7 @@
       <w:r>
         <w:drawing>
           <wp:inline xmlns:a="http://schemas.openxmlformats.org/drawingml/2006/main" xmlns:pic="http://schemas.openxmlformats.org/drawingml/2006/picture">
-            <wp:extent cx="5029200" cy="2094788"/>
+            <wp:extent cx="5029200" cy="2828925"/>
             <wp:docPr id="12" name="Picture 12"/>
             <wp:cNvGraphicFramePr>
               <a:graphicFrameLocks noChangeAspect="1"/>
@@ -2860,7 +2860,7 @@
                   <pic:spPr>
                     <a:xfrm>
                       <a:off x="0" y="0"/>
-                      <a:ext cx="5029200" cy="2094788"/>
+                      <a:ext cx="5029200" cy="2828925"/>
                     </a:xfrm>
                     <a:prstGeom prst="rect"/>
                   </pic:spPr>
@@ -3213,7 +3213,7 @@
       <w:r>
         <w:drawing>
           <wp:inline xmlns:a="http://schemas.openxmlformats.org/drawingml/2006/main" xmlns:pic="http://schemas.openxmlformats.org/drawingml/2006/picture">
-            <wp:extent cx="4572000" cy="1790904"/>
+            <wp:extent cx="4572000" cy="2428875"/>
             <wp:docPr id="13" name="Picture 13"/>
             <wp:cNvGraphicFramePr>
               <a:graphicFrameLocks noChangeAspect="1"/>
@@ -3234,7 +3234,7 @@
                   <pic:spPr>
                     <a:xfrm>
                       <a:off x="0" y="0"/>
-                      <a:ext cx="4572000" cy="1790904"/>
+                      <a:ext cx="4572000" cy="2428875"/>
                     </a:xfrm>
                     <a:prstGeom prst="rect"/>
                   </pic:spPr>
@@ -3310,7 +3310,7 @@
       <w:r>
         <w:drawing>
           <wp:inline xmlns:a="http://schemas.openxmlformats.org/drawingml/2006/main" xmlns:pic="http://schemas.openxmlformats.org/drawingml/2006/picture">
-            <wp:extent cx="5486400" cy="2149084"/>
+            <wp:extent cx="5486400" cy="2914650"/>
             <wp:docPr id="14" name="Picture 14"/>
             <wp:cNvGraphicFramePr>
               <a:graphicFrameLocks noChangeAspect="1"/>
@@ -3331,7 +3331,7 @@
                   <pic:spPr>
                     <a:xfrm>
                       <a:off x="0" y="0"/>
-                      <a:ext cx="5486400" cy="2149084"/>
+                      <a:ext cx="5486400" cy="2914650"/>
                     </a:xfrm>
                     <a:prstGeom prst="rect"/>
                   </pic:spPr>

</xml_diff>

<commit_message>
submission date 17th july 2026
</commit_message>
<xml_diff>
--- a/RecoMart_Report.docx
+++ b/RecoMart_Report.docx
@@ -106,7 +106,19 @@
         <w:rPr>
           <w:sz w:val="24"/>
         </w:rPr>
-        <w:t>Submission Date: 22.07.2026</w:t>
+        <w:t xml:space="preserve">Submission Date: </w:t>
+      </w:r>
+      <w:r>
+        <w:rPr>
+          <w:sz w:val="24"/>
+        </w:rPr>
+        <w:t>17</w:t>
+      </w:r>
+      <w:r>
+        <w:rPr>
+          <w:sz w:val="24"/>
+        </w:rPr>
+        <w:t>.07.2026</w:t>
       </w:r>
     </w:p>
     <w:p/>

</xml_diff>

<commit_message>
submission date 19th july 2026
</commit_message>
<xml_diff>
--- a/RecoMart_Report.docx
+++ b/RecoMart_Report.docx
@@ -112,7 +112,13 @@
         <w:rPr>
           <w:sz w:val="24"/>
         </w:rPr>
-        <w:t>17</w:t>
+        <w:t>1</w:t>
+      </w:r>
+      <w:r>
+        <w:rPr>
+          <w:sz w:val="24"/>
+        </w:rPr>
+        <w:t>9</w:t>
       </w:r>
       <w:r>
         <w:rPr>

</xml_diff>